<commit_message>
1 half of technical task done
</commit_message>
<xml_diff>
--- a/Проект базы данных для приложения Мой кошелёк.docx
+++ b/Проект базы данных для приложения Мой кошелёк.docx
@@ -1,6 +1,6 @@
 
 <file path=word/document.xml><?xml version="1.0" encoding="utf-8"?>
-<w:document xmlns:wpc="http://schemas.microsoft.com/office/word/2010/wordprocessingCanvas" xmlns:cx="http://schemas.microsoft.com/office/drawing/2014/chartex" xmlns:cx1="http://schemas.microsoft.com/office/drawing/2015/9/8/chartex" xmlns:cx2="http://schemas.microsoft.com/office/drawing/2015/10/21/chartex" xmlns:cx3="http://schemas.microsoft.com/office/drawing/2016/5/9/chartex" xmlns:cx4="http://schemas.microsoft.com/office/drawing/2016/5/10/chartex" xmlns:cx5="http://schemas.microsoft.com/office/drawing/2016/5/11/chartex" xmlns:cx6="http://schemas.microsoft.com/office/drawing/2016/5/12/chartex" xmlns:cx7="http://schemas.microsoft.com/office/drawing/2016/5/13/chartex" xmlns:cx8="http://schemas.microsoft.com/office/drawing/2016/5/14/chartex" xmlns:mc="http://schemas.openxmlformats.org/markup-compatibility/2006" xmlns:aink="http://schemas.microsoft.com/office/drawing/2016/ink" xmlns:am3d="http://schemas.microsoft.com/office/drawing/2017/model3d" xmlns:o="urn:schemas-microsoft-com:office:office" xmlns:r="http://schemas.openxmlformats.org/officeDocument/2006/relationships" xmlns:m="http://schemas.openxmlformats.org/officeDocument/2006/math" xmlns:v="urn:schemas-microsoft-com:vml" xmlns:wp14="http://schemas.microsoft.com/office/word/2010/wordprocessingDrawing" xmlns:wp="http://schemas.openxmlformats.org/drawingml/2006/wordprocessingDrawing" xmlns:w10="urn:schemas-microsoft-com:office:word" xmlns:w="http://schemas.openxmlformats.org/wordprocessingml/2006/main" xmlns:w14="http://schemas.microsoft.com/office/word/2010/wordml" xmlns:w15="http://schemas.microsoft.com/office/word/2012/wordml" xmlns:w16cex="http://schemas.microsoft.com/office/word/2018/wordml/cex" xmlns:w16cid="http://schemas.microsoft.com/office/word/2016/wordml/cid" xmlns:w16="http://schemas.microsoft.com/office/word/2018/wordml" xmlns:w16se="http://schemas.microsoft.com/office/word/2015/wordml/symex" xmlns:wpg="http://schemas.microsoft.com/office/word/2010/wordprocessingGroup" xmlns:wpi="http://schemas.microsoft.com/office/word/2010/wordprocessingInk" xmlns:wne="http://schemas.microsoft.com/office/word/2006/wordml" xmlns:wps="http://schemas.microsoft.com/office/word/2010/wordprocessingShape" mc:Ignorable="w14 w15 w16se w16cid w16 w16cex wp14">
+<w:document xmlns:wpc="http://schemas.microsoft.com/office/word/2010/wordprocessingCanvas" xmlns:cx="http://schemas.microsoft.com/office/drawing/2014/chartex" xmlns:cx1="http://schemas.microsoft.com/office/drawing/2015/9/8/chartex" xmlns:cx2="http://schemas.microsoft.com/office/drawing/2015/10/21/chartex" xmlns:cx3="http://schemas.microsoft.com/office/drawing/2016/5/9/chartex" xmlns:cx4="http://schemas.microsoft.com/office/drawing/2016/5/10/chartex" xmlns:cx5="http://schemas.microsoft.com/office/drawing/2016/5/11/chartex" xmlns:cx6="http://schemas.microsoft.com/office/drawing/2016/5/12/chartex" xmlns:cx7="http://schemas.microsoft.com/office/drawing/2016/5/13/chartex" xmlns:cx8="http://schemas.microsoft.com/office/drawing/2016/5/14/chartex" xmlns:mc="http://schemas.openxmlformats.org/markup-compatibility/2006" xmlns:aink="http://schemas.microsoft.com/office/drawing/2016/ink" xmlns:am3d="http://schemas.microsoft.com/office/drawing/2017/model3d" xmlns:o="urn:schemas-microsoft-com:office:office" xmlns:oel="http://schemas.microsoft.com/office/2019/extlst" xmlns:r="http://schemas.openxmlformats.org/officeDocument/2006/relationships" xmlns:m="http://schemas.openxmlformats.org/officeDocument/2006/math" xmlns:v="urn:schemas-microsoft-com:vml" xmlns:wp14="http://schemas.microsoft.com/office/word/2010/wordprocessingDrawing" xmlns:wp="http://schemas.openxmlformats.org/drawingml/2006/wordprocessingDrawing" xmlns:w10="urn:schemas-microsoft-com:office:word" xmlns:w="http://schemas.openxmlformats.org/wordprocessingml/2006/main" xmlns:w14="http://schemas.microsoft.com/office/word/2010/wordml" xmlns:w15="http://schemas.microsoft.com/office/word/2012/wordml" xmlns:w16cex="http://schemas.microsoft.com/office/word/2018/wordml/cex" xmlns:w16cid="http://schemas.microsoft.com/office/word/2016/wordml/cid" xmlns:w16="http://schemas.microsoft.com/office/word/2018/wordml" xmlns:w16du="http://schemas.microsoft.com/office/word/2023/wordml/word16du" xmlns:w16sdtdh="http://schemas.microsoft.com/office/word/2020/wordml/sdtdatahash" xmlns:w16se="http://schemas.microsoft.com/office/word/2015/wordml/symex" xmlns:wpg="http://schemas.microsoft.com/office/word/2010/wordprocessingGroup" xmlns:wpi="http://schemas.microsoft.com/office/word/2010/wordprocessingInk" xmlns:wne="http://schemas.microsoft.com/office/word/2006/wordml" xmlns:wps="http://schemas.microsoft.com/office/word/2010/wordprocessingShape" mc:Ignorable="w14 w15 w16se w16cid w16 w16cex w16sdtdh w16du wp14">
   <w:body>
     <w:p>
       <w:pPr>
@@ -1284,7 +1284,6 @@
                 <w:lang w:val="en-US"/>
               </w:rPr>
             </w:pPr>
-            <w:proofErr w:type="spellStart"/>
             <w:r>
               <w:rPr>
                 <w:rFonts w:cs="Times New Roman"/>
@@ -1293,7 +1292,6 @@
               </w:rPr>
               <w:t>BankBalance</w:t>
             </w:r>
-            <w:proofErr w:type="spellEnd"/>
             <w:r>
               <w:rPr>
                 <w:rFonts w:cs="Times New Roman"/>
@@ -1362,7 +1360,6 @@
                 <w:lang w:val="en-US"/>
               </w:rPr>
             </w:pPr>
-            <w:proofErr w:type="spellStart"/>
             <w:r>
               <w:rPr>
                 <w:rFonts w:cs="Times New Roman"/>
@@ -1371,7 +1368,6 @@
               </w:rPr>
               <w:t>BankBalance</w:t>
             </w:r>
-            <w:proofErr w:type="spellEnd"/>
             <w:r>
               <w:rPr>
                 <w:rFonts w:cs="Times New Roman"/>
@@ -1440,7 +1436,6 @@
                 <w:lang w:val="en-US"/>
               </w:rPr>
             </w:pPr>
-            <w:proofErr w:type="spellStart"/>
             <w:r>
               <w:rPr>
                 <w:rFonts w:cs="Times New Roman"/>
@@ -1449,7 +1444,6 @@
               </w:rPr>
               <w:t>BankBalance</w:t>
             </w:r>
-            <w:proofErr w:type="spellEnd"/>
             <w:r>
               <w:rPr>
                 <w:rFonts w:cs="Times New Roman"/>
@@ -1674,7 +1668,6 @@
                 <w:lang w:val="en-US"/>
               </w:rPr>
             </w:pPr>
-            <w:proofErr w:type="spellStart"/>
             <w:r>
               <w:rPr>
                 <w:rFonts w:cs="Times New Roman"/>
@@ -1683,7 +1676,6 @@
               </w:rPr>
               <w:t>BankBalance</w:t>
             </w:r>
-            <w:proofErr w:type="spellEnd"/>
             <w:r>
               <w:rPr>
                 <w:rFonts w:cs="Times New Roman"/>
@@ -2570,7 +2562,6 @@
                 <w:szCs w:val="28"/>
               </w:rPr>
             </w:pPr>
-            <w:proofErr w:type="spellStart"/>
             <w:r>
               <w:rPr>
                 <w:rFonts w:cs="Times New Roman"/>
@@ -2579,7 +2570,6 @@
               </w:rPr>
               <w:t>BankBalance</w:t>
             </w:r>
-            <w:proofErr w:type="spellEnd"/>
             <w:r>
               <w:rPr>
                 <w:rFonts w:cs="Times New Roman"/>
@@ -3557,7 +3547,6 @@
                 <w:lang w:val="en-US"/>
               </w:rPr>
             </w:pPr>
-            <w:proofErr w:type="spellStart"/>
             <w:r>
               <w:rPr>
                 <w:rFonts w:cs="Times New Roman"/>
@@ -3566,7 +3555,6 @@
               </w:rPr>
               <w:t>OperationType_id</w:t>
             </w:r>
-            <w:proofErr w:type="spellEnd"/>
           </w:p>
         </w:tc>
         <w:tc>
@@ -6134,16 +6122,16 @@
         <mc:AlternateContent>
           <mc:Choice Requires="wps">
             <w:drawing>
-              <wp:anchor distT="0" distB="0" distL="114300" distR="114300" simplePos="0" relativeHeight="251689984" behindDoc="0" locked="0" layoutInCell="1" allowOverlap="1" wp14:anchorId="74EA8285" wp14:editId="5381F99B">
+              <wp:anchor distT="0" distB="0" distL="114300" distR="114300" simplePos="0" relativeHeight="251689984" behindDoc="0" locked="0" layoutInCell="1" allowOverlap="1" wp14:anchorId="74EA8285" wp14:editId="4D5A2A83">
                 <wp:simplePos x="0" y="0"/>
                 <wp:positionH relativeFrom="column">
-                  <wp:posOffset>52628</wp:posOffset>
+                  <wp:posOffset>52629</wp:posOffset>
                 </wp:positionH>
                 <wp:positionV relativeFrom="paragraph">
                   <wp:posOffset>18936</wp:posOffset>
                 </wp:positionV>
-                <wp:extent cx="2374711" cy="1809750"/>
-                <wp:effectExtent l="0" t="0" r="26035" b="19050"/>
+                <wp:extent cx="2374711" cy="2073910"/>
+                <wp:effectExtent l="0" t="0" r="26035" b="21590"/>
                 <wp:wrapNone/>
                 <wp:docPr id="24" name="Прямоугольник 24"/>
                 <wp:cNvGraphicFramePr/>
@@ -6154,7 +6142,7 @@
                       <wps:spPr>
                         <a:xfrm>
                           <a:off x="0" y="0"/>
-                          <a:ext cx="2374711" cy="1809750"/>
+                          <a:ext cx="2374711" cy="2073910"/>
                         </a:xfrm>
                         <a:prstGeom prst="rect">
                           <a:avLst/>
@@ -6259,7 +6247,6 @@
                                     </w:rPr>
                                     <w:t>#</w:t>
                                   </w:r>
-                                  <w:proofErr w:type="spellStart"/>
                                   <w:r>
                                     <w:rPr>
                                       <w:rFonts w:cs="Times New Roman"/>
@@ -6268,7 +6255,6 @@
                                     </w:rPr>
                                     <w:t>BankBalance_id</w:t>
                                   </w:r>
-                                  <w:proofErr w:type="spellEnd"/>
                                 </w:p>
                               </w:tc>
                             </w:tr>
@@ -6296,7 +6282,6 @@
                                     </w:rPr>
                                     <w:t>*</w:t>
                                   </w:r>
-                                  <w:proofErr w:type="spellStart"/>
                                   <w:r>
                                     <w:rPr>
                                       <w:rFonts w:cs="Times New Roman"/>
@@ -6305,7 +6290,6 @@
                                     </w:rPr>
                                     <w:t>BankBalance</w:t>
                                   </w:r>
-                                  <w:proofErr w:type="spellEnd"/>
                                   <w:r>
                                     <w:rPr>
                                       <w:rFonts w:cs="Times New Roman"/>
@@ -6349,7 +6333,6 @@
                                     </w:rPr>
                                     <w:t>*</w:t>
                                   </w:r>
-                                  <w:proofErr w:type="spellStart"/>
                                   <w:r>
                                     <w:rPr>
                                       <w:rFonts w:cs="Times New Roman"/>
@@ -6358,7 +6341,6 @@
                                     </w:rPr>
                                     <w:t>BankBalance</w:t>
                                   </w:r>
-                                  <w:proofErr w:type="spellEnd"/>
                                   <w:r>
                                     <w:rPr>
                                       <w:rFonts w:cs="Times New Roman"/>
@@ -6437,6 +6419,42 @@
                                 <w:p>
                                   <w:pPr>
                                     <w:jc w:val="center"/>
+                                    <w:rPr>
+                                      <w:rFonts w:cs="Times New Roman"/>
+                                      <w:b/>
+                                      <w:bCs/>
+                                      <w:szCs w:val="28"/>
+                                      <w:lang w:val="en-US"/>
+                                    </w:rPr>
+                                  </w:pPr>
+                                  <w:r>
+                                    <w:rPr>
+                                      <w:rFonts w:cs="Times New Roman"/>
+                                      <w:szCs w:val="28"/>
+                                    </w:rPr>
+                                    <w:t>*</w:t>
+                                  </w:r>
+                                  <w:proofErr w:type="spellStart"/>
+                                  <w:r>
+                                    <w:rPr>
+                                      <w:rFonts w:cs="Times New Roman"/>
+                                      <w:szCs w:val="28"/>
+                                      <w:lang w:val="en-US"/>
+                                    </w:rPr>
+                                    <w:t>BankBalance_balance</w:t>
+                                  </w:r>
+                                  <w:proofErr w:type="spellEnd"/>
+                                </w:p>
+                              </w:tc>
+                            </w:tr>
+                            <w:tr>
+                              <w:tc>
+                                <w:tcPr>
+                                  <w:tcW w:w="3466" w:type="dxa"/>
+                                </w:tcPr>
+                                <w:p>
+                                  <w:pPr>
+                                    <w:jc w:val="center"/>
                                   </w:pPr>
                                   <w:r>
                                     <w:rPr>
@@ -6448,7 +6466,6 @@
                                     </w:rPr>
                                     <w:t>*</w:t>
                                   </w:r>
-                                  <w:proofErr w:type="spellStart"/>
                                   <w:r>
                                     <w:rPr>
                                       <w:rFonts w:cs="Times New Roman"/>
@@ -6457,7 +6474,6 @@
                                     </w:rPr>
                                     <w:t>BankBalance</w:t>
                                   </w:r>
-                                  <w:proofErr w:type="spellEnd"/>
                                   <w:r>
                                     <w:rPr>
                                       <w:rFonts w:cs="Times New Roman"/>
@@ -6502,7 +6518,7 @@
           </mc:Choice>
           <mc:Fallback>
             <w:pict>
-              <v:rect w14:anchorId="74EA8285" id="Прямоугольник 24" o:spid="_x0000_s1039" style="position:absolute;margin-left:4.15pt;margin-top:1.5pt;width:187pt;height:142.5pt;z-index:251689984;visibility:visible;mso-wrap-style:square;mso-width-percent:0;mso-height-percent:0;mso-wrap-distance-left:9pt;mso-wrap-distance-top:0;mso-wrap-distance-right:9pt;mso-wrap-distance-bottom:0;mso-position-horizontal:absolute;mso-position-horizontal-relative:text;mso-position-vertical:absolute;mso-position-vertical-relative:text;mso-width-percent:0;mso-height-percent:0;mso-width-relative:margin;mso-height-relative:margin;v-text-anchor:middle" o:gfxdata="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" fillcolor="white [3201]" strokecolor="black [3200]" strokeweight="1pt">
+              <v:rect w14:anchorId="74EA8285" id="Прямоугольник 24" o:spid="_x0000_s1039" style="position:absolute;margin-left:4.15pt;margin-top:1.5pt;width:187pt;height:163.3pt;z-index:251689984;visibility:visible;mso-wrap-style:square;mso-width-percent:0;mso-height-percent:0;mso-wrap-distance-left:9pt;mso-wrap-distance-top:0;mso-wrap-distance-right:9pt;mso-wrap-distance-bottom:0;mso-position-horizontal:absolute;mso-position-horizontal-relative:text;mso-position-vertical:absolute;mso-position-vertical-relative:text;mso-width-percent:0;mso-height-percent:0;mso-width-relative:margin;mso-height-relative:margin;v-text-anchor:middle" o:gfxdata="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" fillcolor="white [3201]" strokecolor="black [3200]" strokeweight="1pt">
                 <v:textbox>
                   <w:txbxContent>
                     <w:tbl>
@@ -6588,7 +6604,6 @@
                               </w:rPr>
                               <w:t>#</w:t>
                             </w:r>
-                            <w:proofErr w:type="spellStart"/>
                             <w:r>
                               <w:rPr>
                                 <w:rFonts w:cs="Times New Roman"/>
@@ -6597,7 +6612,6 @@
                               </w:rPr>
                               <w:t>BankBalance_id</w:t>
                             </w:r>
-                            <w:proofErr w:type="spellEnd"/>
                           </w:p>
                         </w:tc>
                       </w:tr>
@@ -6625,7 +6639,6 @@
                               </w:rPr>
                               <w:t>*</w:t>
                             </w:r>
-                            <w:proofErr w:type="spellStart"/>
                             <w:r>
                               <w:rPr>
                                 <w:rFonts w:cs="Times New Roman"/>
@@ -6634,7 +6647,6 @@
                               </w:rPr>
                               <w:t>BankBalance</w:t>
                             </w:r>
-                            <w:proofErr w:type="spellEnd"/>
                             <w:r>
                               <w:rPr>
                                 <w:rFonts w:cs="Times New Roman"/>
@@ -6678,7 +6690,6 @@
                               </w:rPr>
                               <w:t>*</w:t>
                             </w:r>
-                            <w:proofErr w:type="spellStart"/>
                             <w:r>
                               <w:rPr>
                                 <w:rFonts w:cs="Times New Roman"/>
@@ -6687,7 +6698,6 @@
                               </w:rPr>
                               <w:t>BankBalance</w:t>
                             </w:r>
-                            <w:proofErr w:type="spellEnd"/>
                             <w:r>
                               <w:rPr>
                                 <w:rFonts w:cs="Times New Roman"/>
@@ -6766,6 +6776,42 @@
                           <w:p>
                             <w:pPr>
                               <w:jc w:val="center"/>
+                              <w:rPr>
+                                <w:rFonts w:cs="Times New Roman"/>
+                                <w:b/>
+                                <w:bCs/>
+                                <w:szCs w:val="28"/>
+                                <w:lang w:val="en-US"/>
+                              </w:rPr>
+                            </w:pPr>
+                            <w:r>
+                              <w:rPr>
+                                <w:rFonts w:cs="Times New Roman"/>
+                                <w:szCs w:val="28"/>
+                              </w:rPr>
+                              <w:t>*</w:t>
+                            </w:r>
+                            <w:proofErr w:type="spellStart"/>
+                            <w:r>
+                              <w:rPr>
+                                <w:rFonts w:cs="Times New Roman"/>
+                                <w:szCs w:val="28"/>
+                                <w:lang w:val="en-US"/>
+                              </w:rPr>
+                              <w:t>BankBalance_balance</w:t>
+                            </w:r>
+                            <w:proofErr w:type="spellEnd"/>
+                          </w:p>
+                        </w:tc>
+                      </w:tr>
+                      <w:tr>
+                        <w:tc>
+                          <w:tcPr>
+                            <w:tcW w:w="3466" w:type="dxa"/>
+                          </w:tcPr>
+                          <w:p>
+                            <w:pPr>
+                              <w:jc w:val="center"/>
                             </w:pPr>
                             <w:r>
                               <w:rPr>
@@ -6777,7 +6823,6 @@
                               </w:rPr>
                               <w:t>*</w:t>
                             </w:r>
-                            <w:proofErr w:type="spellStart"/>
                             <w:r>
                               <w:rPr>
                                 <w:rFonts w:cs="Times New Roman"/>
@@ -6786,7 +6831,6 @@
                               </w:rPr>
                               <w:t>BankBalance</w:t>
                             </w:r>
-                            <w:proofErr w:type="spellEnd"/>
                             <w:r>
                               <w:rPr>
                                 <w:rFonts w:cs="Times New Roman"/>
@@ -6934,7 +6978,6 @@
                                     </w:rPr>
                                     <w:t>#</w:t>
                                   </w:r>
-                                  <w:proofErr w:type="spellStart"/>
                                   <w:r>
                                     <w:rPr>
                                       <w:rFonts w:cs="Times New Roman"/>
@@ -6943,7 +6986,6 @@
                                     </w:rPr>
                                     <w:t>Operation_id</w:t>
                                   </w:r>
-                                  <w:proofErr w:type="spellEnd"/>
                                 </w:p>
                               </w:tc>
                             </w:tr>
@@ -6971,7 +7013,6 @@
                                     </w:rPr>
                                     <w:t>*</w:t>
                                   </w:r>
-                                  <w:proofErr w:type="spellStart"/>
                                   <w:r>
                                     <w:rPr>
                                       <w:rFonts w:cs="Times New Roman"/>
@@ -6988,7 +7029,6 @@
                                     </w:rPr>
                                     <w:t>Type_id</w:t>
                                   </w:r>
-                                  <w:proofErr w:type="spellEnd"/>
                                 </w:p>
                               </w:tc>
                             </w:tr>
@@ -7174,7 +7214,6 @@
                                     </w:rPr>
                                     <w:t>*</w:t>
                                   </w:r>
-                                  <w:proofErr w:type="spellStart"/>
                                   <w:r>
                                     <w:rPr>
                                       <w:rFonts w:cs="Times New Roman"/>
@@ -7183,7 +7222,6 @@
                                     </w:rPr>
                                     <w:t>BankBalance</w:t>
                                   </w:r>
-                                  <w:proofErr w:type="spellEnd"/>
                                   <w:r>
                                     <w:rPr>
                                       <w:rFonts w:cs="Times New Roman"/>
@@ -7226,7 +7264,7 @@
           </mc:Choice>
           <mc:Fallback>
             <w:pict>
-              <v:rect w14:anchorId="579AFB54" id="Прямоугольник 25" o:spid="_x0000_s1040" style="position:absolute;margin-left:126.1pt;margin-top:1.65pt;width:177.3pt;height:163.35pt;z-index:251692032;visibility:visible;mso-wrap-style:square;mso-width-percent:0;mso-height-percent:0;mso-wrap-distance-left:9pt;mso-wrap-distance-top:0;mso-wrap-distance-right:9pt;mso-wrap-distance-bottom:0;mso-position-horizontal:right;mso-position-horizontal-relative:margin;mso-position-vertical:absolute;mso-position-vertical-relative:text;mso-width-percent:0;mso-height-percent:0;mso-width-relative:margin;mso-height-relative:margin;v-text-anchor:middle" o:gfxdata="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" fillcolor="white [3201]" strokecolor="black [3200]" strokeweight="1pt">
+              <v:rect w14:anchorId="579AFB54" id="Прямоугольник 25" o:spid="_x0000_s1040" style="position:absolute;margin-left:126.1pt;margin-top:1.65pt;width:177.3pt;height:163.35pt;z-index:251692032;visibility:visible;mso-wrap-style:square;mso-width-percent:0;mso-height-percent:0;mso-wrap-distance-left:9pt;mso-wrap-distance-top:0;mso-wrap-distance-right:9pt;mso-wrap-distance-bottom:0;mso-position-horizontal:right;mso-position-horizontal-relative:margin;mso-position-vertical:absolute;mso-position-vertical-relative:text;mso-width-percent:0;mso-height-percent:0;mso-width-relative:margin;mso-height-relative:margin;v-text-anchor:middle" o:gfxdata="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" fillcolor="white [3201]" strokecolor="black [3200]" strokeweight="1pt">
                 <v:textbox>
                   <w:txbxContent>
                     <w:tbl>
@@ -7298,7 +7336,6 @@
                               </w:rPr>
                               <w:t>#</w:t>
                             </w:r>
-                            <w:proofErr w:type="spellStart"/>
                             <w:r>
                               <w:rPr>
                                 <w:rFonts w:cs="Times New Roman"/>
@@ -7307,7 +7344,6 @@
                               </w:rPr>
                               <w:t>Operation_id</w:t>
                             </w:r>
-                            <w:proofErr w:type="spellEnd"/>
                           </w:p>
                         </w:tc>
                       </w:tr>
@@ -7335,7 +7371,6 @@
                               </w:rPr>
                               <w:t>*</w:t>
                             </w:r>
-                            <w:proofErr w:type="spellStart"/>
                             <w:r>
                               <w:rPr>
                                 <w:rFonts w:cs="Times New Roman"/>
@@ -7352,7 +7387,6 @@
                               </w:rPr>
                               <w:t>Type_id</w:t>
                             </w:r>
-                            <w:proofErr w:type="spellEnd"/>
                           </w:p>
                         </w:tc>
                       </w:tr>
@@ -7538,7 +7572,6 @@
                               </w:rPr>
                               <w:t>*</w:t>
                             </w:r>
-                            <w:proofErr w:type="spellStart"/>
                             <w:r>
                               <w:rPr>
                                 <w:rFonts w:cs="Times New Roman"/>
@@ -7547,7 +7580,6 @@
                               </w:rPr>
                               <w:t>BankBalance</w:t>
                             </w:r>
-                            <w:proofErr w:type="spellEnd"/>
                             <w:r>
                               <w:rPr>
                                 <w:rFonts w:cs="Times New Roman"/>
@@ -8052,7 +8084,6 @@
                                     </w:rPr>
                                     <w:t>#</w:t>
                                   </w:r>
-                                  <w:proofErr w:type="spellStart"/>
                                   <w:r>
                                     <w:rPr>
                                       <w:rFonts w:cs="Times New Roman"/>
@@ -8061,7 +8092,6 @@
                                     </w:rPr>
                                     <w:t>OperationType_id</w:t>
                                   </w:r>
-                                  <w:proofErr w:type="spellEnd"/>
                                 </w:p>
                               </w:tc>
                             </w:tr>
@@ -8126,7 +8156,7 @@
           </mc:Choice>
           <mc:Fallback>
             <w:pict>
-              <v:rect w14:anchorId="4BCC8C7B" id="Прямоугольник 26" o:spid="_x0000_s1041" style="position:absolute;margin-left:126.1pt;margin-top:.55pt;width:177.3pt;height:85.95pt;z-index:251694080;visibility:visible;mso-wrap-style:square;mso-width-percent:0;mso-height-percent:0;mso-wrap-distance-left:9pt;mso-wrap-distance-top:0;mso-wrap-distance-right:9pt;mso-wrap-distance-bottom:0;mso-position-horizontal:right;mso-position-horizontal-relative:margin;mso-position-vertical:absolute;mso-position-vertical-relative:text;mso-width-percent:0;mso-height-percent:0;mso-width-relative:margin;mso-height-relative:margin;v-text-anchor:middle" o:gfxdata="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" fillcolor="white [3201]" strokecolor="black [3200]" strokeweight="1pt">
+              <v:rect w14:anchorId="4BCC8C7B" id="Прямоугольник 26" o:spid="_x0000_s1041" style="position:absolute;margin-left:126.1pt;margin-top:.55pt;width:177.3pt;height:85.95pt;z-index:251694080;visibility:visible;mso-wrap-style:square;mso-width-percent:0;mso-height-percent:0;mso-wrap-distance-left:9pt;mso-wrap-distance-top:0;mso-wrap-distance-right:9pt;mso-wrap-distance-bottom:0;mso-position-horizontal:right;mso-position-horizontal-relative:margin;mso-position-vertical:absolute;mso-position-vertical-relative:text;mso-width-percent:0;mso-height-percent:0;mso-width-relative:margin;mso-height-relative:margin;v-text-anchor:middle" o:gfxdata="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" fillcolor="white [3201]" strokecolor="black [3200]" strokeweight="1pt">
                 <v:textbox>
                   <w:txbxContent>
                     <w:tbl>
@@ -8191,7 +8221,6 @@
                               </w:rPr>
                               <w:t>#</w:t>
                             </w:r>
-                            <w:proofErr w:type="spellStart"/>
                             <w:r>
                               <w:rPr>
                                 <w:rFonts w:cs="Times New Roman"/>
@@ -8200,7 +8229,6 @@
                               </w:rPr>
                               <w:t>OperationType_id</w:t>
                             </w:r>
-                            <w:proofErr w:type="spellEnd"/>
                           </w:p>
                         </w:tc>
                       </w:tr>
@@ -8362,7 +8390,6 @@
                                     </w:rPr>
                                     <w:t>#</w:t>
                                   </w:r>
-                                  <w:proofErr w:type="spellStart"/>
                                   <w:r>
                                     <w:rPr>
                                       <w:rFonts w:cs="Times New Roman"/>
@@ -8371,7 +8398,6 @@
                                     </w:rPr>
                                     <w:t>BankBalanceType_id</w:t>
                                   </w:r>
-                                  <w:proofErr w:type="spellEnd"/>
                                 </w:p>
                               </w:tc>
                             </w:tr>
@@ -8451,7 +8477,7 @@
           </mc:Choice>
           <mc:Fallback>
             <w:pict>
-              <v:rect w14:anchorId="5779DCA6" id="Прямоугольник 28" o:spid="_x0000_s1042" style="position:absolute;margin-left:0;margin-top:.65pt;width:177.3pt;height:85.95pt;z-index:251696128;visibility:visible;mso-wrap-style:square;mso-width-percent:0;mso-height-percent:0;mso-wrap-distance-left:9pt;mso-wrap-distance-top:0;mso-wrap-distance-right:9pt;mso-wrap-distance-bottom:0;mso-position-horizontal:left;mso-position-horizontal-relative:margin;mso-position-vertical:absolute;mso-position-vertical-relative:text;mso-width-percent:0;mso-height-percent:0;mso-width-relative:margin;mso-height-relative:margin;v-text-anchor:middle" o:gfxdata="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" fillcolor="white [3201]" strokecolor="black [3200]" strokeweight="1pt">
+              <v:rect w14:anchorId="5779DCA6" id="Прямоугольник 28" o:spid="_x0000_s1042" style="position:absolute;margin-left:0;margin-top:.65pt;width:177.3pt;height:85.95pt;z-index:251696128;visibility:visible;mso-wrap-style:square;mso-width-percent:0;mso-height-percent:0;mso-wrap-distance-left:9pt;mso-wrap-distance-top:0;mso-wrap-distance-right:9pt;mso-wrap-distance-bottom:0;mso-position-horizontal:left;mso-position-horizontal-relative:margin;mso-position-vertical:absolute;mso-position-vertical-relative:text;mso-width-percent:0;mso-height-percent:0;mso-width-relative:margin;mso-height-relative:margin;v-text-anchor:middle" o:gfxdata="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" fillcolor="white [3201]" strokecolor="black [3200]" strokeweight="1pt">
                 <v:textbox>
                   <w:txbxContent>
                     <w:tbl>
@@ -8516,7 +8542,6 @@
                               </w:rPr>
                               <w:t>#</w:t>
                             </w:r>
-                            <w:proofErr w:type="spellStart"/>
                             <w:r>
                               <w:rPr>
                                 <w:rFonts w:cs="Times New Roman"/>
@@ -8525,7 +8550,6 @@
                               </w:rPr>
                               <w:t>BankBalanceType_id</w:t>
                             </w:r>
-                            <w:proofErr w:type="spellEnd"/>
                           </w:p>
                         </w:tc>
                       </w:tr>
@@ -9280,7 +9304,6 @@
                 <w:lang w:val="en-US"/>
               </w:rPr>
             </w:pPr>
-            <w:proofErr w:type="spellStart"/>
             <w:r>
               <w:rPr>
                 <w:rFonts w:cs="Times New Roman"/>
@@ -9289,7 +9312,6 @@
               </w:rPr>
               <w:t>BankBalance</w:t>
             </w:r>
-            <w:proofErr w:type="spellEnd"/>
             <w:r>
               <w:t>_</w:t>
             </w:r>
@@ -9374,7 +9396,6 @@
                 <w:lang w:val="en-US"/>
               </w:rPr>
             </w:pPr>
-            <w:proofErr w:type="spellStart"/>
             <w:r>
               <w:rPr>
                 <w:rFonts w:cs="Times New Roman"/>
@@ -9383,7 +9404,6 @@
               </w:rPr>
               <w:t>BankBalance</w:t>
             </w:r>
-            <w:proofErr w:type="spellEnd"/>
             <w:r>
               <w:rPr>
                 <w:rFonts w:cs="Times New Roman"/>
@@ -9447,7 +9467,15 @@
             <w:tcW w:w="408" w:type="dxa"/>
           </w:tcPr>
           <w:p>
-            <w:r>
+            <w:pPr>
+              <w:rPr>
+                <w:lang w:val="en-US"/>
+              </w:rPr>
+            </w:pPr>
+            <w:r>
+              <w:rPr>
+                <w:lang w:val="en-US"/>
+              </w:rPr>
               <w:t>4</w:t>
             </w:r>
           </w:p>
@@ -9459,6 +9487,8 @@
           <w:p>
             <w:pPr>
               <w:rPr>
+                <w:rFonts w:cs="Times New Roman"/>
+                <w:szCs w:val="28"/>
                 <w:lang w:val="en-US"/>
               </w:rPr>
             </w:pPr>
@@ -9471,22 +9501,15 @@
               </w:rPr>
               <w:t>BankBalanceType</w:t>
             </w:r>
+            <w:r>
+              <w:rPr>
+                <w:rFonts w:cs="Times New Roman"/>
+                <w:szCs w:val="28"/>
+                <w:lang w:val="en-US"/>
+              </w:rPr>
+              <w:t>_balance</w:t>
+            </w:r>
             <w:proofErr w:type="spellEnd"/>
-            <w:r>
-              <w:rPr>
-                <w:rFonts w:cs="Times New Roman"/>
-                <w:szCs w:val="28"/>
-              </w:rPr>
-              <w:t>_</w:t>
-            </w:r>
-            <w:r>
-              <w:rPr>
-                <w:rFonts w:cs="Times New Roman"/>
-                <w:szCs w:val="28"/>
-                <w:lang w:val="en-US"/>
-              </w:rPr>
-              <w:t>id</w:t>
-            </w:r>
           </w:p>
         </w:tc>
         <w:tc>
@@ -9495,7 +9518,7 @@
           </w:tcPr>
           <w:p>
             <w:r>
-              <w:t>Код типа счёта</w:t>
+              <w:t>Текущий баланс</w:t>
             </w:r>
           </w:p>
         </w:tc>
@@ -9505,10 +9528,7 @@
           </w:tcPr>
           <w:p>
             <w:r>
-              <w:t xml:space="preserve">Счётчик, числовой, </w:t>
-            </w:r>
-            <w:r>
-              <w:t>целочисленный, беззнаковый</w:t>
+              <w:t>Числовой, вещественный</w:t>
             </w:r>
           </w:p>
         </w:tc>
@@ -9526,11 +9546,7 @@
           <w:tcPr>
             <w:tcW w:w="1370" w:type="dxa"/>
           </w:tcPr>
-          <w:p>
-            <w:r>
-              <w:t>ВК (внешний ключ)</w:t>
-            </w:r>
-          </w:p>
+          <w:p/>
         </w:tc>
       </w:tr>
       <w:tr>
@@ -9539,7 +9555,15 @@
             <w:tcW w:w="408" w:type="dxa"/>
           </w:tcPr>
           <w:p>
-            <w:r>
+            <w:pPr>
+              <w:rPr>
+                <w:lang w:val="en-US"/>
+              </w:rPr>
+            </w:pPr>
+            <w:r>
+              <w:rPr>
+                <w:lang w:val="en-US"/>
+              </w:rPr>
               <w:t>5</w:t>
             </w:r>
           </w:p>
@@ -9549,6 +9573,11 @@
             <w:tcW w:w="2337" w:type="dxa"/>
           </w:tcPr>
           <w:p>
+            <w:pPr>
+              <w:rPr>
+                <w:lang w:val="en-US"/>
+              </w:rPr>
+            </w:pPr>
             <w:proofErr w:type="spellStart"/>
             <w:r>
               <w:rPr>
@@ -9556,9 +9585,102 @@
                 <w:szCs w:val="28"/>
                 <w:lang w:val="en-US"/>
               </w:rPr>
+              <w:t>BankBalanceType</w:t>
+            </w:r>
+            <w:proofErr w:type="spellEnd"/>
+            <w:r>
+              <w:rPr>
+                <w:rFonts w:cs="Times New Roman"/>
+                <w:szCs w:val="28"/>
+              </w:rPr>
+              <w:t>_</w:t>
+            </w:r>
+            <w:r>
+              <w:rPr>
+                <w:rFonts w:cs="Times New Roman"/>
+                <w:szCs w:val="28"/>
+                <w:lang w:val="en-US"/>
+              </w:rPr>
+              <w:t>id</w:t>
+            </w:r>
+          </w:p>
+        </w:tc>
+        <w:tc>
+          <w:tcPr>
+            <w:tcW w:w="1293" w:type="dxa"/>
+          </w:tcPr>
+          <w:p>
+            <w:r>
+              <w:t>Код типа счёта</w:t>
+            </w:r>
+          </w:p>
+        </w:tc>
+        <w:tc>
+          <w:tcPr>
+            <w:tcW w:w="2455" w:type="dxa"/>
+          </w:tcPr>
+          <w:p>
+            <w:r>
+              <w:t xml:space="preserve">Счётчик, числовой, </w:t>
+            </w:r>
+            <w:r>
+              <w:t>целочисленный, беззнаковый</w:t>
+            </w:r>
+          </w:p>
+        </w:tc>
+        <w:tc>
+          <w:tcPr>
+            <w:tcW w:w="1482" w:type="dxa"/>
+          </w:tcPr>
+          <w:p>
+            <w:r>
+              <w:t>Да</w:t>
+            </w:r>
+          </w:p>
+        </w:tc>
+        <w:tc>
+          <w:tcPr>
+            <w:tcW w:w="1370" w:type="dxa"/>
+          </w:tcPr>
+          <w:p>
+            <w:r>
+              <w:t>ВК (внешний ключ)</w:t>
+            </w:r>
+          </w:p>
+        </w:tc>
+      </w:tr>
+      <w:tr>
+        <w:tc>
+          <w:tcPr>
+            <w:tcW w:w="408" w:type="dxa"/>
+          </w:tcPr>
+          <w:p>
+            <w:pPr>
+              <w:rPr>
+                <w:lang w:val="en-US"/>
+              </w:rPr>
+            </w:pPr>
+            <w:r>
+              <w:rPr>
+                <w:lang w:val="en-US"/>
+              </w:rPr>
+              <w:t>6</w:t>
+            </w:r>
+          </w:p>
+        </w:tc>
+        <w:tc>
+          <w:tcPr>
+            <w:tcW w:w="2337" w:type="dxa"/>
+          </w:tcPr>
+          <w:p>
+            <w:r>
+              <w:rPr>
+                <w:rFonts w:cs="Times New Roman"/>
+                <w:szCs w:val="28"/>
+                <w:lang w:val="en-US"/>
+              </w:rPr>
               <w:t>BankBalance</w:t>
             </w:r>
-            <w:proofErr w:type="spellEnd"/>
             <w:r>
               <w:rPr>
                 <w:rFonts w:cs="Times New Roman"/>
@@ -9631,19 +9753,7 @@
         <w:rPr>
           <w:rFonts w:cs="Times New Roman"/>
         </w:rPr>
-        <w:t>— Атрибуты «</w:t>
-      </w:r>
-      <w:r>
-        <w:rPr>
-          <w:rFonts w:cs="Times New Roman"/>
-        </w:rPr>
-        <w:t>Типы счетов</w:t>
-      </w:r>
-      <w:r>
-        <w:rPr>
-          <w:rFonts w:cs="Times New Roman"/>
-        </w:rPr>
-        <w:t>»</w:t>
+        <w:t>— Атрибуты «Типы счетов»</w:t>
       </w:r>
     </w:p>
     <w:tbl>
@@ -9883,15 +9993,7 @@
                 <w:szCs w:val="28"/>
                 <w:lang w:val="en-US"/>
               </w:rPr>
-              <w:t>BankBalanceType_</w:t>
-            </w:r>
-            <w:r>
-              <w:rPr>
-                <w:rFonts w:cs="Times New Roman"/>
-                <w:szCs w:val="28"/>
-                <w:lang w:val="en-US"/>
-              </w:rPr>
-              <w:t>name</w:t>
+              <w:t>BankBalanceType_name</w:t>
             </w:r>
             <w:proofErr w:type="spellEnd"/>
           </w:p>
@@ -9932,7 +10034,11 @@
           </w:tcPr>
           <w:p>
             <w:r>
-              <w:t>Цифры и буквы латиницы и кириллицы</w:t>
+              <w:t xml:space="preserve">Цифры и буквы латиницы </w:t>
+            </w:r>
+            <w:r>
+              <w:lastRenderedPageBreak/>
+              <w:t>и кириллицы</w:t>
             </w:r>
           </w:p>
         </w:tc>
@@ -10129,10 +10235,7 @@
           </w:tcPr>
           <w:p>
             <w:r>
-              <w:t xml:space="preserve">Код </w:t>
-            </w:r>
-            <w:r>
-              <w:t>операции</w:t>
+              <w:t>Код операции</w:t>
             </w:r>
           </w:p>
         </w:tc>
@@ -10198,15 +10301,7 @@
                 <w:szCs w:val="28"/>
                 <w:lang w:val="en-US"/>
               </w:rPr>
-              <w:t>Operation</w:t>
-            </w:r>
-            <w:r>
-              <w:rPr>
-                <w:rFonts w:cs="Times New Roman"/>
-                <w:szCs w:val="28"/>
-                <w:lang w:val="en-US"/>
-              </w:rPr>
-              <w:t>Type</w:t>
+              <w:t>OperationType</w:t>
             </w:r>
             <w:proofErr w:type="spellEnd"/>
             <w:r>
@@ -10321,10 +10416,7 @@
           </w:tcPr>
           <w:p>
             <w:r>
-              <w:t xml:space="preserve">Краткое описание </w:t>
-            </w:r>
-            <w:r>
-              <w:t>операции</w:t>
+              <w:t>Краткое описание операции</w:t>
             </w:r>
           </w:p>
         </w:tc>
@@ -10534,15 +10626,7 @@
                 <w:szCs w:val="28"/>
                 <w:lang w:val="en-US"/>
               </w:rPr>
-              <w:t>BankBalance</w:t>
-            </w:r>
-            <w:r>
-              <w:rPr>
-                <w:rFonts w:cs="Times New Roman"/>
-                <w:szCs w:val="28"/>
-                <w:lang w:val="en-US"/>
-              </w:rPr>
-              <w:t>_id</w:t>
+              <w:t>BankBalance_id</w:t>
             </w:r>
             <w:proofErr w:type="spellEnd"/>
           </w:p>
@@ -10763,7 +10847,6 @@
                 <w:lang w:val="en-US"/>
               </w:rPr>
             </w:pPr>
-            <w:proofErr w:type="spellStart"/>
             <w:r>
               <w:rPr>
                 <w:rFonts w:cs="Times New Roman"/>
@@ -10780,7 +10863,6 @@
               </w:rPr>
               <w:t>_id</w:t>
             </w:r>
-            <w:proofErr w:type="spellEnd"/>
           </w:p>
         </w:tc>
         <w:tc>
@@ -10928,10 +11010,7 @@
         </w:tc>
       </w:tr>
     </w:tbl>
-    <w:p>
-      <w:bookmarkStart w:id="7" w:name="_GoBack"/>
-      <w:bookmarkEnd w:id="7"/>
-    </w:p>
+    <w:p/>
     <w:sectPr>
       <w:pgSz w:w="11906" w:h="16838"/>
       <w:pgMar w:top="1134" w:right="850" w:bottom="1134" w:left="1701" w:header="708" w:footer="708" w:gutter="0"/>
@@ -10943,7 +11022,7 @@
 </file>
 
 <file path=word/endnotes.xml><?xml version="1.0" encoding="utf-8"?>
-<w:endnotes xmlns:wpc="http://schemas.microsoft.com/office/word/2010/wordprocessingCanvas" xmlns:cx="http://schemas.microsoft.com/office/drawing/2014/chartex" xmlns:cx1="http://schemas.microsoft.com/office/drawing/2015/9/8/chartex" xmlns:cx2="http://schemas.microsoft.com/office/drawing/2015/10/21/chartex" xmlns:cx3="http://schemas.microsoft.com/office/drawing/2016/5/9/chartex" xmlns:cx4="http://schemas.microsoft.com/office/drawing/2016/5/10/chartex" xmlns:cx5="http://schemas.microsoft.com/office/drawing/2016/5/11/chartex" xmlns:cx6="http://schemas.microsoft.com/office/drawing/2016/5/12/chartex" xmlns:cx7="http://schemas.microsoft.com/office/drawing/2016/5/13/chartex" xmlns:cx8="http://schemas.microsoft.com/office/drawing/2016/5/14/chartex" xmlns:mc="http://schemas.openxmlformats.org/markup-compatibility/2006" xmlns:aink="http://schemas.microsoft.com/office/drawing/2016/ink" xmlns:am3d="http://schemas.microsoft.com/office/drawing/2017/model3d" xmlns:o="urn:schemas-microsoft-com:office:office" xmlns:r="http://schemas.openxmlformats.org/officeDocument/2006/relationships" xmlns:m="http://schemas.openxmlformats.org/officeDocument/2006/math" xmlns:v="urn:schemas-microsoft-com:vml" xmlns:wp14="http://schemas.microsoft.com/office/word/2010/wordprocessingDrawing" xmlns:wp="http://schemas.openxmlformats.org/drawingml/2006/wordprocessingDrawing" xmlns:w10="urn:schemas-microsoft-com:office:word" xmlns:w="http://schemas.openxmlformats.org/wordprocessingml/2006/main" xmlns:w14="http://schemas.microsoft.com/office/word/2010/wordml" xmlns:w15="http://schemas.microsoft.com/office/word/2012/wordml" xmlns:w16cex="http://schemas.microsoft.com/office/word/2018/wordml/cex" xmlns:w16cid="http://schemas.microsoft.com/office/word/2016/wordml/cid" xmlns:w16="http://schemas.microsoft.com/office/word/2018/wordml" xmlns:w16se="http://schemas.microsoft.com/office/word/2015/wordml/symex" xmlns:wpg="http://schemas.microsoft.com/office/word/2010/wordprocessingGroup" xmlns:wpi="http://schemas.microsoft.com/office/word/2010/wordprocessingInk" xmlns:wne="http://schemas.microsoft.com/office/word/2006/wordml" xmlns:wps="http://schemas.microsoft.com/office/word/2010/wordprocessingShape" mc:Ignorable="w14 w15 w16se w16cid w16 w16cex wp14">
+<w:endnotes xmlns:wpc="http://schemas.microsoft.com/office/word/2010/wordprocessingCanvas" xmlns:cx="http://schemas.microsoft.com/office/drawing/2014/chartex" xmlns:cx1="http://schemas.microsoft.com/office/drawing/2015/9/8/chartex" xmlns:cx2="http://schemas.microsoft.com/office/drawing/2015/10/21/chartex" xmlns:cx3="http://schemas.microsoft.com/office/drawing/2016/5/9/chartex" xmlns:cx4="http://schemas.microsoft.com/office/drawing/2016/5/10/chartex" xmlns:cx5="http://schemas.microsoft.com/office/drawing/2016/5/11/chartex" xmlns:cx6="http://schemas.microsoft.com/office/drawing/2016/5/12/chartex" xmlns:cx7="http://schemas.microsoft.com/office/drawing/2016/5/13/chartex" xmlns:cx8="http://schemas.microsoft.com/office/drawing/2016/5/14/chartex" xmlns:mc="http://schemas.openxmlformats.org/markup-compatibility/2006" xmlns:aink="http://schemas.microsoft.com/office/drawing/2016/ink" xmlns:am3d="http://schemas.microsoft.com/office/drawing/2017/model3d" xmlns:o="urn:schemas-microsoft-com:office:office" xmlns:oel="http://schemas.microsoft.com/office/2019/extlst" xmlns:r="http://schemas.openxmlformats.org/officeDocument/2006/relationships" xmlns:m="http://schemas.openxmlformats.org/officeDocument/2006/math" xmlns:v="urn:schemas-microsoft-com:vml" xmlns:wp14="http://schemas.microsoft.com/office/word/2010/wordprocessingDrawing" xmlns:wp="http://schemas.openxmlformats.org/drawingml/2006/wordprocessingDrawing" xmlns:w10="urn:schemas-microsoft-com:office:word" xmlns:w="http://schemas.openxmlformats.org/wordprocessingml/2006/main" xmlns:w14="http://schemas.microsoft.com/office/word/2010/wordml" xmlns:w15="http://schemas.microsoft.com/office/word/2012/wordml" xmlns:w16cex="http://schemas.microsoft.com/office/word/2018/wordml/cex" xmlns:w16cid="http://schemas.microsoft.com/office/word/2016/wordml/cid" xmlns:w16="http://schemas.microsoft.com/office/word/2018/wordml" xmlns:w16du="http://schemas.microsoft.com/office/word/2023/wordml/word16du" xmlns:w16sdtdh="http://schemas.microsoft.com/office/word/2020/wordml/sdtdatahash" xmlns:w16se="http://schemas.microsoft.com/office/word/2015/wordml/symex" xmlns:wpg="http://schemas.microsoft.com/office/word/2010/wordprocessingGroup" xmlns:wpi="http://schemas.microsoft.com/office/word/2010/wordprocessingInk" xmlns:wne="http://schemas.microsoft.com/office/word/2006/wordml" xmlns:wps="http://schemas.microsoft.com/office/word/2010/wordprocessingShape" mc:Ignorable="w14 w15 w16se w16cid w16 w16cex w16sdtdh w16du wp14">
   <w:endnote w:type="separator" w:id="-1">
     <w:p>
       <w:pPr>
@@ -10968,7 +11047,7 @@
 </file>
 
 <file path=word/footer1.xml><?xml version="1.0" encoding="utf-8"?>
-<w:ftr xmlns:wpc="http://schemas.microsoft.com/office/word/2010/wordprocessingCanvas" xmlns:cx="http://schemas.microsoft.com/office/drawing/2014/chartex" xmlns:cx1="http://schemas.microsoft.com/office/drawing/2015/9/8/chartex" xmlns:cx2="http://schemas.microsoft.com/office/drawing/2015/10/21/chartex" xmlns:cx3="http://schemas.microsoft.com/office/drawing/2016/5/9/chartex" xmlns:cx4="http://schemas.microsoft.com/office/drawing/2016/5/10/chartex" xmlns:cx5="http://schemas.microsoft.com/office/drawing/2016/5/11/chartex" xmlns:cx6="http://schemas.microsoft.com/office/drawing/2016/5/12/chartex" xmlns:cx7="http://schemas.microsoft.com/office/drawing/2016/5/13/chartex" xmlns:cx8="http://schemas.microsoft.com/office/drawing/2016/5/14/chartex" xmlns:mc="http://schemas.openxmlformats.org/markup-compatibility/2006" xmlns:aink="http://schemas.microsoft.com/office/drawing/2016/ink" xmlns:am3d="http://schemas.microsoft.com/office/drawing/2017/model3d" xmlns:o="urn:schemas-microsoft-com:office:office" xmlns:r="http://schemas.openxmlformats.org/officeDocument/2006/relationships" xmlns:m="http://schemas.openxmlformats.org/officeDocument/2006/math" xmlns:v="urn:schemas-microsoft-com:vml" xmlns:wp14="http://schemas.microsoft.com/office/word/2010/wordprocessingDrawing" xmlns:wp="http://schemas.openxmlformats.org/drawingml/2006/wordprocessingDrawing" xmlns:w10="urn:schemas-microsoft-com:office:word" xmlns:w="http://schemas.openxmlformats.org/wordprocessingml/2006/main" xmlns:w14="http://schemas.microsoft.com/office/word/2010/wordml" xmlns:w15="http://schemas.microsoft.com/office/word/2012/wordml" xmlns:w16cex="http://schemas.microsoft.com/office/word/2018/wordml/cex" xmlns:w16cid="http://schemas.microsoft.com/office/word/2016/wordml/cid" xmlns:w16="http://schemas.microsoft.com/office/word/2018/wordml" xmlns:w16se="http://schemas.microsoft.com/office/word/2015/wordml/symex" xmlns:wpg="http://schemas.microsoft.com/office/word/2010/wordprocessingGroup" xmlns:wpi="http://schemas.microsoft.com/office/word/2010/wordprocessingInk" xmlns:wne="http://schemas.microsoft.com/office/word/2006/wordml" xmlns:wps="http://schemas.microsoft.com/office/word/2010/wordprocessingShape" mc:Ignorable="w14 w15 w16se w16cid w16 w16cex wp14">
+<w:ftr xmlns:wpc="http://schemas.microsoft.com/office/word/2010/wordprocessingCanvas" xmlns:cx="http://schemas.microsoft.com/office/drawing/2014/chartex" xmlns:cx1="http://schemas.microsoft.com/office/drawing/2015/9/8/chartex" xmlns:cx2="http://schemas.microsoft.com/office/drawing/2015/10/21/chartex" xmlns:cx3="http://schemas.microsoft.com/office/drawing/2016/5/9/chartex" xmlns:cx4="http://schemas.microsoft.com/office/drawing/2016/5/10/chartex" xmlns:cx5="http://schemas.microsoft.com/office/drawing/2016/5/11/chartex" xmlns:cx6="http://schemas.microsoft.com/office/drawing/2016/5/12/chartex" xmlns:cx7="http://schemas.microsoft.com/office/drawing/2016/5/13/chartex" xmlns:cx8="http://schemas.microsoft.com/office/drawing/2016/5/14/chartex" xmlns:mc="http://schemas.openxmlformats.org/markup-compatibility/2006" xmlns:aink="http://schemas.microsoft.com/office/drawing/2016/ink" xmlns:am3d="http://schemas.microsoft.com/office/drawing/2017/model3d" xmlns:o="urn:schemas-microsoft-com:office:office" xmlns:oel="http://schemas.microsoft.com/office/2019/extlst" xmlns:r="http://schemas.openxmlformats.org/officeDocument/2006/relationships" xmlns:m="http://schemas.openxmlformats.org/officeDocument/2006/math" xmlns:v="urn:schemas-microsoft-com:vml" xmlns:wp14="http://schemas.microsoft.com/office/word/2010/wordprocessingDrawing" xmlns:wp="http://schemas.openxmlformats.org/drawingml/2006/wordprocessingDrawing" xmlns:w10="urn:schemas-microsoft-com:office:word" xmlns:w="http://schemas.openxmlformats.org/wordprocessingml/2006/main" xmlns:w14="http://schemas.microsoft.com/office/word/2010/wordml" xmlns:w15="http://schemas.microsoft.com/office/word/2012/wordml" xmlns:w16cex="http://schemas.microsoft.com/office/word/2018/wordml/cex" xmlns:w16cid="http://schemas.microsoft.com/office/word/2016/wordml/cid" xmlns:w16="http://schemas.microsoft.com/office/word/2018/wordml" xmlns:w16du="http://schemas.microsoft.com/office/word/2023/wordml/word16du" xmlns:w16sdtdh="http://schemas.microsoft.com/office/word/2020/wordml/sdtdatahash" xmlns:w16se="http://schemas.microsoft.com/office/word/2015/wordml/symex" xmlns:wpg="http://schemas.microsoft.com/office/word/2010/wordprocessingGroup" xmlns:wpi="http://schemas.microsoft.com/office/word/2010/wordprocessingInk" xmlns:wne="http://schemas.microsoft.com/office/word/2006/wordml" xmlns:wps="http://schemas.microsoft.com/office/word/2010/wordprocessingShape" mc:Ignorable="w14 w15 w16se w16cid w16 w16cex w16sdtdh w16du wp14">
   <w:sdt>
     <w:sdtPr>
       <w:rPr>
@@ -10981,7 +11060,6 @@
         <w:docPartUnique/>
       </w:docPartObj>
     </w:sdtPr>
-    <w:sdtEndPr/>
     <w:sdtContent>
       <w:p>
         <w:pPr>
@@ -11035,7 +11113,7 @@
 </file>
 
 <file path=word/footnotes.xml><?xml version="1.0" encoding="utf-8"?>
-<w:footnotes xmlns:wpc="http://schemas.microsoft.com/office/word/2010/wordprocessingCanvas" xmlns:cx="http://schemas.microsoft.com/office/drawing/2014/chartex" xmlns:cx1="http://schemas.microsoft.com/office/drawing/2015/9/8/chartex" xmlns:cx2="http://schemas.microsoft.com/office/drawing/2015/10/21/chartex" xmlns:cx3="http://schemas.microsoft.com/office/drawing/2016/5/9/chartex" xmlns:cx4="http://schemas.microsoft.com/office/drawing/2016/5/10/chartex" xmlns:cx5="http://schemas.microsoft.com/office/drawing/2016/5/11/chartex" xmlns:cx6="http://schemas.microsoft.com/office/drawing/2016/5/12/chartex" xmlns:cx7="http://schemas.microsoft.com/office/drawing/2016/5/13/chartex" xmlns:cx8="http://schemas.microsoft.com/office/drawing/2016/5/14/chartex" xmlns:mc="http://schemas.openxmlformats.org/markup-compatibility/2006" xmlns:aink="http://schemas.microsoft.com/office/drawing/2016/ink" xmlns:am3d="http://schemas.microsoft.com/office/drawing/2017/model3d" xmlns:o="urn:schemas-microsoft-com:office:office" xmlns:r="http://schemas.openxmlformats.org/officeDocument/2006/relationships" xmlns:m="http://schemas.openxmlformats.org/officeDocument/2006/math" xmlns:v="urn:schemas-microsoft-com:vml" xmlns:wp14="http://schemas.microsoft.com/office/word/2010/wordprocessingDrawing" xmlns:wp="http://schemas.openxmlformats.org/drawingml/2006/wordprocessingDrawing" xmlns:w10="urn:schemas-microsoft-com:office:word" xmlns:w="http://schemas.openxmlformats.org/wordprocessingml/2006/main" xmlns:w14="http://schemas.microsoft.com/office/word/2010/wordml" xmlns:w15="http://schemas.microsoft.com/office/word/2012/wordml" xmlns:w16cex="http://schemas.microsoft.com/office/word/2018/wordml/cex" xmlns:w16cid="http://schemas.microsoft.com/office/word/2016/wordml/cid" xmlns:w16="http://schemas.microsoft.com/office/word/2018/wordml" xmlns:w16se="http://schemas.microsoft.com/office/word/2015/wordml/symex" xmlns:wpg="http://schemas.microsoft.com/office/word/2010/wordprocessingGroup" xmlns:wpi="http://schemas.microsoft.com/office/word/2010/wordprocessingInk" xmlns:wne="http://schemas.microsoft.com/office/word/2006/wordml" xmlns:wps="http://schemas.microsoft.com/office/word/2010/wordprocessingShape" mc:Ignorable="w14 w15 w16se w16cid w16 w16cex wp14">
+<w:footnotes xmlns:wpc="http://schemas.microsoft.com/office/word/2010/wordprocessingCanvas" xmlns:cx="http://schemas.microsoft.com/office/drawing/2014/chartex" xmlns:cx1="http://schemas.microsoft.com/office/drawing/2015/9/8/chartex" xmlns:cx2="http://schemas.microsoft.com/office/drawing/2015/10/21/chartex" xmlns:cx3="http://schemas.microsoft.com/office/drawing/2016/5/9/chartex" xmlns:cx4="http://schemas.microsoft.com/office/drawing/2016/5/10/chartex" xmlns:cx5="http://schemas.microsoft.com/office/drawing/2016/5/11/chartex" xmlns:cx6="http://schemas.microsoft.com/office/drawing/2016/5/12/chartex" xmlns:cx7="http://schemas.microsoft.com/office/drawing/2016/5/13/chartex" xmlns:cx8="http://schemas.microsoft.com/office/drawing/2016/5/14/chartex" xmlns:mc="http://schemas.openxmlformats.org/markup-compatibility/2006" xmlns:aink="http://schemas.microsoft.com/office/drawing/2016/ink" xmlns:am3d="http://schemas.microsoft.com/office/drawing/2017/model3d" xmlns:o="urn:schemas-microsoft-com:office:office" xmlns:oel="http://schemas.microsoft.com/office/2019/extlst" xmlns:r="http://schemas.openxmlformats.org/officeDocument/2006/relationships" xmlns:m="http://schemas.openxmlformats.org/officeDocument/2006/math" xmlns:v="urn:schemas-microsoft-com:vml" xmlns:wp14="http://schemas.microsoft.com/office/word/2010/wordprocessingDrawing" xmlns:wp="http://schemas.openxmlformats.org/drawingml/2006/wordprocessingDrawing" xmlns:w10="urn:schemas-microsoft-com:office:word" xmlns:w="http://schemas.openxmlformats.org/wordprocessingml/2006/main" xmlns:w14="http://schemas.microsoft.com/office/word/2010/wordml" xmlns:w15="http://schemas.microsoft.com/office/word/2012/wordml" xmlns:w16cex="http://schemas.microsoft.com/office/word/2018/wordml/cex" xmlns:w16cid="http://schemas.microsoft.com/office/word/2016/wordml/cid" xmlns:w16="http://schemas.microsoft.com/office/word/2018/wordml" xmlns:w16du="http://schemas.microsoft.com/office/word/2023/wordml/word16du" xmlns:w16sdtdh="http://schemas.microsoft.com/office/word/2020/wordml/sdtdatahash" xmlns:w16se="http://schemas.microsoft.com/office/word/2015/wordml/symex" xmlns:wpg="http://schemas.microsoft.com/office/word/2010/wordprocessingGroup" xmlns:wpi="http://schemas.microsoft.com/office/word/2010/wordprocessingInk" xmlns:wne="http://schemas.microsoft.com/office/word/2006/wordml" xmlns:wps="http://schemas.microsoft.com/office/word/2010/wordprocessingShape" mc:Ignorable="w14 w15 w16se w16cid w16 w16cex w16sdtdh w16du wp14">
   <w:footnote w:type="separator" w:id="-1">
     <w:p>
       <w:pPr>
@@ -11060,7 +11138,7 @@
 </file>
 
 <file path=word/numbering.xml><?xml version="1.0" encoding="utf-8"?>
-<w:numbering xmlns:wpc="http://schemas.microsoft.com/office/word/2010/wordprocessingCanvas" xmlns:cx="http://schemas.microsoft.com/office/drawing/2014/chartex" xmlns:cx1="http://schemas.microsoft.com/office/drawing/2015/9/8/chartex" xmlns:cx2="http://schemas.microsoft.com/office/drawing/2015/10/21/chartex" xmlns:cx3="http://schemas.microsoft.com/office/drawing/2016/5/9/chartex" xmlns:cx4="http://schemas.microsoft.com/office/drawing/2016/5/10/chartex" xmlns:cx5="http://schemas.microsoft.com/office/drawing/2016/5/11/chartex" xmlns:cx6="http://schemas.microsoft.com/office/drawing/2016/5/12/chartex" xmlns:cx7="http://schemas.microsoft.com/office/drawing/2016/5/13/chartex" xmlns:cx8="http://schemas.microsoft.com/office/drawing/2016/5/14/chartex" xmlns:mc="http://schemas.openxmlformats.org/markup-compatibility/2006" xmlns:aink="http://schemas.microsoft.com/office/drawing/2016/ink" xmlns:am3d="http://schemas.microsoft.com/office/drawing/2017/model3d" xmlns:o="urn:schemas-microsoft-com:office:office" xmlns:r="http://schemas.openxmlformats.org/officeDocument/2006/relationships" xmlns:m="http://schemas.openxmlformats.org/officeDocument/2006/math" xmlns:v="urn:schemas-microsoft-com:vml" xmlns:wp14="http://schemas.microsoft.com/office/word/2010/wordprocessingDrawing" xmlns:wp="http://schemas.openxmlformats.org/drawingml/2006/wordprocessingDrawing" xmlns:w10="urn:schemas-microsoft-com:office:word" xmlns:w="http://schemas.openxmlformats.org/wordprocessingml/2006/main" xmlns:w14="http://schemas.microsoft.com/office/word/2010/wordml" xmlns:w15="http://schemas.microsoft.com/office/word/2012/wordml" xmlns:w16cex="http://schemas.microsoft.com/office/word/2018/wordml/cex" xmlns:w16cid="http://schemas.microsoft.com/office/word/2016/wordml/cid" xmlns:w16="http://schemas.microsoft.com/office/word/2018/wordml" xmlns:w16se="http://schemas.microsoft.com/office/word/2015/wordml/symex" xmlns:wpg="http://schemas.microsoft.com/office/word/2010/wordprocessingGroup" xmlns:wpi="http://schemas.microsoft.com/office/word/2010/wordprocessingInk" xmlns:wne="http://schemas.microsoft.com/office/word/2006/wordml" xmlns:wps="http://schemas.microsoft.com/office/word/2010/wordprocessingShape" mc:Ignorable="w14 w15 w16se w16cid w16 w16cex wp14">
+<w:numbering xmlns:wpc="http://schemas.microsoft.com/office/word/2010/wordprocessingCanvas" xmlns:cx="http://schemas.microsoft.com/office/drawing/2014/chartex" xmlns:cx1="http://schemas.microsoft.com/office/drawing/2015/9/8/chartex" xmlns:cx2="http://schemas.microsoft.com/office/drawing/2015/10/21/chartex" xmlns:cx3="http://schemas.microsoft.com/office/drawing/2016/5/9/chartex" xmlns:cx4="http://schemas.microsoft.com/office/drawing/2016/5/10/chartex" xmlns:cx5="http://schemas.microsoft.com/office/drawing/2016/5/11/chartex" xmlns:cx6="http://schemas.microsoft.com/office/drawing/2016/5/12/chartex" xmlns:cx7="http://schemas.microsoft.com/office/drawing/2016/5/13/chartex" xmlns:cx8="http://schemas.microsoft.com/office/drawing/2016/5/14/chartex" xmlns:mc="http://schemas.openxmlformats.org/markup-compatibility/2006" xmlns:aink="http://schemas.microsoft.com/office/drawing/2016/ink" xmlns:am3d="http://schemas.microsoft.com/office/drawing/2017/model3d" xmlns:o="urn:schemas-microsoft-com:office:office" xmlns:oel="http://schemas.microsoft.com/office/2019/extlst" xmlns:r="http://schemas.openxmlformats.org/officeDocument/2006/relationships" xmlns:m="http://schemas.openxmlformats.org/officeDocument/2006/math" xmlns:v="urn:schemas-microsoft-com:vml" xmlns:wp14="http://schemas.microsoft.com/office/word/2010/wordprocessingDrawing" xmlns:wp="http://schemas.openxmlformats.org/drawingml/2006/wordprocessingDrawing" xmlns:w10="urn:schemas-microsoft-com:office:word" xmlns:w="http://schemas.openxmlformats.org/wordprocessingml/2006/main" xmlns:w14="http://schemas.microsoft.com/office/word/2010/wordml" xmlns:w15="http://schemas.microsoft.com/office/word/2012/wordml" xmlns:w16cex="http://schemas.microsoft.com/office/word/2018/wordml/cex" xmlns:w16cid="http://schemas.microsoft.com/office/word/2016/wordml/cid" xmlns:w16="http://schemas.microsoft.com/office/word/2018/wordml" xmlns:w16du="http://schemas.microsoft.com/office/word/2023/wordml/word16du" xmlns:w16sdtdh="http://schemas.microsoft.com/office/word/2020/wordml/sdtdatahash" xmlns:w16se="http://schemas.microsoft.com/office/word/2015/wordml/symex" xmlns:wpg="http://schemas.microsoft.com/office/word/2010/wordprocessingGroup" xmlns:wpi="http://schemas.microsoft.com/office/word/2010/wordprocessingInk" xmlns:wne="http://schemas.microsoft.com/office/word/2006/wordml" xmlns:wps="http://schemas.microsoft.com/office/word/2010/wordprocessingShape" mc:Ignorable="w14 w15 w16se w16cid w16 w16cex w16sdtdh w16du wp14">
   <w:abstractNum w:abstractNumId="0" w15:restartNumberingAfterBreak="0">
     <w:nsid w:val="02EC3DC6"/>
     <w:multiLevelType w:val="hybridMultilevel"/>
@@ -13856,95 +13934,95 @@
       </w:rPr>
     </w:lvl>
   </w:abstractNum>
-  <w:num w:numId="1">
+  <w:num w:numId="1" w16cid:durableId="87578583">
     <w:abstractNumId w:val="1"/>
   </w:num>
-  <w:num w:numId="2">
+  <w:num w:numId="2" w16cid:durableId="627273230">
     <w:abstractNumId w:val="21"/>
   </w:num>
-  <w:num w:numId="3">
+  <w:num w:numId="3" w16cid:durableId="124543739">
     <w:abstractNumId w:val="13"/>
   </w:num>
-  <w:num w:numId="4">
+  <w:num w:numId="4" w16cid:durableId="986083998">
     <w:abstractNumId w:val="25"/>
   </w:num>
-  <w:num w:numId="5">
+  <w:num w:numId="5" w16cid:durableId="1525438896">
     <w:abstractNumId w:val="3"/>
   </w:num>
-  <w:num w:numId="6">
+  <w:num w:numId="6" w16cid:durableId="307518440">
     <w:abstractNumId w:val="5"/>
   </w:num>
-  <w:num w:numId="7">
+  <w:num w:numId="7" w16cid:durableId="1694844449">
     <w:abstractNumId w:val="2"/>
   </w:num>
-  <w:num w:numId="8">
+  <w:num w:numId="8" w16cid:durableId="1003584843">
     <w:abstractNumId w:val="16"/>
   </w:num>
-  <w:num w:numId="9">
+  <w:num w:numId="9" w16cid:durableId="590743111">
     <w:abstractNumId w:val="19"/>
   </w:num>
-  <w:num w:numId="10">
+  <w:num w:numId="10" w16cid:durableId="1799882037">
     <w:abstractNumId w:val="22"/>
   </w:num>
-  <w:num w:numId="11">
+  <w:num w:numId="11" w16cid:durableId="1794904092">
     <w:abstractNumId w:val="10"/>
   </w:num>
-  <w:num w:numId="12">
+  <w:num w:numId="12" w16cid:durableId="306058445">
     <w:abstractNumId w:val="18"/>
   </w:num>
-  <w:num w:numId="13">
+  <w:num w:numId="13" w16cid:durableId="513615272">
     <w:abstractNumId w:val="24"/>
   </w:num>
-  <w:num w:numId="14">
+  <w:num w:numId="14" w16cid:durableId="1415204012">
     <w:abstractNumId w:val="7"/>
   </w:num>
-  <w:num w:numId="15">
+  <w:num w:numId="15" w16cid:durableId="2042970764">
     <w:abstractNumId w:val="17"/>
   </w:num>
-  <w:num w:numId="16">
+  <w:num w:numId="16" w16cid:durableId="1981499246">
     <w:abstractNumId w:val="27"/>
   </w:num>
-  <w:num w:numId="17">
+  <w:num w:numId="17" w16cid:durableId="1845781510">
     <w:abstractNumId w:val="23"/>
   </w:num>
-  <w:num w:numId="18">
+  <w:num w:numId="18" w16cid:durableId="826434639">
     <w:abstractNumId w:val="11"/>
   </w:num>
-  <w:num w:numId="19">
+  <w:num w:numId="19" w16cid:durableId="485516529">
     <w:abstractNumId w:val="6"/>
   </w:num>
-  <w:num w:numId="20">
+  <w:num w:numId="20" w16cid:durableId="46951996">
     <w:abstractNumId w:val="9"/>
   </w:num>
-  <w:num w:numId="21">
+  <w:num w:numId="21" w16cid:durableId="98449842">
     <w:abstractNumId w:val="14"/>
   </w:num>
-  <w:num w:numId="22">
+  <w:num w:numId="22" w16cid:durableId="1891915039">
     <w:abstractNumId w:val="20"/>
   </w:num>
-  <w:num w:numId="23">
+  <w:num w:numId="23" w16cid:durableId="1234663909">
     <w:abstractNumId w:val="8"/>
   </w:num>
-  <w:num w:numId="24">
+  <w:num w:numId="24" w16cid:durableId="1433356147">
     <w:abstractNumId w:val="4"/>
   </w:num>
-  <w:num w:numId="25">
+  <w:num w:numId="25" w16cid:durableId="882861139">
     <w:abstractNumId w:val="15"/>
   </w:num>
-  <w:num w:numId="26">
+  <w:num w:numId="26" w16cid:durableId="274139427">
     <w:abstractNumId w:val="26"/>
   </w:num>
-  <w:num w:numId="27">
+  <w:num w:numId="27" w16cid:durableId="1528834332">
     <w:abstractNumId w:val="0"/>
   </w:num>
-  <w:num w:numId="28">
+  <w:num w:numId="28" w16cid:durableId="219246353">
     <w:abstractNumId w:val="12"/>
   </w:num>
 </w:numbering>
 </file>
 
 <file path=word/styles.xml><?xml version="1.0" encoding="utf-8"?>
-<w:styles xmlns:mc="http://schemas.openxmlformats.org/markup-compatibility/2006" xmlns:r="http://schemas.openxmlformats.org/officeDocument/2006/relationships" xmlns:w="http://schemas.openxmlformats.org/wordprocessingml/2006/main" xmlns:w14="http://schemas.microsoft.com/office/word/2010/wordml" xmlns:w15="http://schemas.microsoft.com/office/word/2012/wordml" xmlns:w16cex="http://schemas.microsoft.com/office/word/2018/wordml/cex" xmlns:w16cid="http://schemas.microsoft.com/office/word/2016/wordml/cid" xmlns:w16="http://schemas.microsoft.com/office/word/2018/wordml" xmlns:w16se="http://schemas.microsoft.com/office/word/2015/wordml/symex" mc:Ignorable="w14 w15 w16se w16cid w16 w16cex">
+<w:styles xmlns:mc="http://schemas.openxmlformats.org/markup-compatibility/2006" xmlns:r="http://schemas.openxmlformats.org/officeDocument/2006/relationships" xmlns:w="http://schemas.openxmlformats.org/wordprocessingml/2006/main" xmlns:w14="http://schemas.microsoft.com/office/word/2010/wordml" xmlns:w15="http://schemas.microsoft.com/office/word/2012/wordml" xmlns:w16cex="http://schemas.microsoft.com/office/word/2018/wordml/cex" xmlns:w16cid="http://schemas.microsoft.com/office/word/2016/wordml/cid" xmlns:w16="http://schemas.microsoft.com/office/word/2018/wordml" xmlns:w16du="http://schemas.microsoft.com/office/word/2023/wordml/word16du" xmlns:w16sdtdh="http://schemas.microsoft.com/office/word/2020/wordml/sdtdatahash" xmlns:w16se="http://schemas.microsoft.com/office/word/2015/wordml/symex" mc:Ignorable="w14 w15 w16se w16cid w16 w16cex w16sdtdh w16du">
   <w:docDefaults>
     <w:rPrDefault>
       <w:rPr>

</xml_diff>

<commit_message>
Operation types page done
</commit_message>
<xml_diff>
--- a/Проект базы данных для приложения Мой кошелёк.docx
+++ b/Проект базы данных для приложения Мой кошелёк.docx
@@ -1097,24 +1097,14 @@
                 <w:lang w:val="en-US"/>
               </w:rPr>
             </w:pPr>
-            <w:proofErr w:type="spellStart"/>
             <w:r>
               <w:rPr>
                 <w:rFonts w:cs="Times New Roman"/>
                 <w:szCs w:val="28"/>
                 <w:lang w:val="en-US"/>
               </w:rPr>
-              <w:t>BankBalance_</w:t>
-            </w:r>
-            <w:r>
-              <w:rPr>
-                <w:rFonts w:cs="Times New Roman"/>
-                <w:szCs w:val="28"/>
-                <w:lang w:val="en-US"/>
-              </w:rPr>
               <w:t>id</w:t>
             </w:r>
-            <w:proofErr w:type="spellEnd"/>
           </w:p>
         </w:tc>
         <w:tc>
@@ -2019,16 +2009,14 @@
                 <w:lang w:val="en-US"/>
               </w:rPr>
             </w:pPr>
-            <w:proofErr w:type="spellStart"/>
             <w:r>
               <w:rPr>
                 <w:rFonts w:cs="Times New Roman"/>
                 <w:szCs w:val="28"/>
                 <w:lang w:val="en-US"/>
               </w:rPr>
-              <w:t>Operation_id</w:t>
-            </w:r>
-            <w:proofErr w:type="spellEnd"/>
+              <w:t>id</w:t>
+            </w:r>
           </w:p>
         </w:tc>
         <w:tc>
@@ -6253,7 +6241,7 @@
                                       <w:szCs w:val="28"/>
                                       <w:lang w:val="en-US"/>
                                     </w:rPr>
-                                    <w:t>BankBalance_id</w:t>
+                                    <w:t>id</w:t>
                                   </w:r>
                                 </w:p>
                               </w:tc>
@@ -6610,7 +6598,7 @@
                                 <w:szCs w:val="28"/>
                                 <w:lang w:val="en-US"/>
                               </w:rPr>
-                              <w:t>BankBalance_id</w:t>
+                              <w:t>id</w:t>
                             </w:r>
                           </w:p>
                         </w:tc>
@@ -6984,7 +6972,7 @@
                                       <w:szCs w:val="28"/>
                                       <w:lang w:val="en-US"/>
                                     </w:rPr>
-                                    <w:t>Operation_id</w:t>
+                                    <w:t>id</w:t>
                                   </w:r>
                                 </w:p>
                               </w:tc>
@@ -7342,7 +7330,7 @@
                                 <w:szCs w:val="28"/>
                                 <w:lang w:val="en-US"/>
                               </w:rPr>
-                              <w:t>Operation_id</w:t>
+                              <w:t>id</w:t>
                             </w:r>
                           </w:p>
                         </w:tc>
@@ -8090,7 +8078,7 @@
                                       <w:szCs w:val="28"/>
                                       <w:lang w:val="en-US"/>
                                     </w:rPr>
-                                    <w:t>OperationType_id</w:t>
+                                    <w:t>id</w:t>
                                   </w:r>
                                 </w:p>
                               </w:tc>
@@ -8227,7 +8215,7 @@
                                 <w:szCs w:val="28"/>
                                 <w:lang w:val="en-US"/>
                               </w:rPr>
-                              <w:t>OperationType_id</w:t>
+                              <w:t>id</w:t>
                             </w:r>
                           </w:p>
                         </w:tc>
@@ -8396,7 +8384,7 @@
                                       <w:szCs w:val="28"/>
                                       <w:lang w:val="en-US"/>
                                     </w:rPr>
-                                    <w:t>BankBalanceType_id</w:t>
+                                    <w:t>id</w:t>
                                   </w:r>
                                 </w:p>
                               </w:tc>
@@ -8548,7 +8536,7 @@
                                 <w:szCs w:val="28"/>
                                 <w:lang w:val="en-US"/>
                               </w:rPr>
-                              <w:t>BankBalanceType_id</w:t>
+                              <w:t>id</w:t>
                             </w:r>
                           </w:p>
                         </w:tc>
@@ -9221,16 +9209,14 @@
                 <w:lang w:val="en-US"/>
               </w:rPr>
             </w:pPr>
-            <w:proofErr w:type="spellStart"/>
             <w:r>
               <w:rPr>
                 <w:rFonts w:cs="Times New Roman"/>
                 <w:szCs w:val="28"/>
                 <w:lang w:val="en-US"/>
               </w:rPr>
-              <w:t>BankBalance_id</w:t>
-            </w:r>
-            <w:proofErr w:type="spellEnd"/>
+              <w:t>id</w:t>
+            </w:r>
           </w:p>
         </w:tc>
         <w:tc>
@@ -9499,15 +9485,7 @@
                 <w:szCs w:val="28"/>
                 <w:lang w:val="en-US"/>
               </w:rPr>
-              <w:t>BankBalanceType</w:t>
-            </w:r>
-            <w:r>
-              <w:rPr>
-                <w:rFonts w:cs="Times New Roman"/>
-                <w:szCs w:val="28"/>
-                <w:lang w:val="en-US"/>
-              </w:rPr>
-              <w:t>_balance</w:t>
+              <w:t>BankBalanceType_balance</w:t>
             </w:r>
             <w:proofErr w:type="spellEnd"/>
           </w:p>
@@ -10217,16 +10195,14 @@
                 <w:lang w:val="en-US"/>
               </w:rPr>
             </w:pPr>
-            <w:proofErr w:type="spellStart"/>
             <w:r>
               <w:rPr>
                 <w:rFonts w:cs="Times New Roman"/>
                 <w:szCs w:val="28"/>
                 <w:lang w:val="en-US"/>
               </w:rPr>
-              <w:t>Operation_id</w:t>
-            </w:r>
-            <w:proofErr w:type="spellEnd"/>
+              <w:t>id</w:t>
+            </w:r>
           </w:p>
         </w:tc>
         <w:tc>
@@ -10559,11 +10535,17 @@
           </w:tcPr>
           <w:p>
             <w:r>
-              <w:t>Дата и время (ДД.ММ.ГГГГ.</w:t>
+              <w:t>Дата и время (ГГГГ</w:t>
+            </w:r>
+            <w:r>
+              <w:t>.ММ.</w:t>
             </w:r>
             <w:proofErr w:type="gramStart"/>
             <w:r>
-              <w:t>ЧЧ:ММ</w:t>
+              <w:t>ДД</w:t>
+            </w:r>
+            <w:r>
+              <w:t>.ЧЧ:ММ</w:t>
             </w:r>
             <w:proofErr w:type="gramEnd"/>
             <w:r>
@@ -10853,15 +10835,7 @@
                 <w:szCs w:val="28"/>
                 <w:lang w:val="en-US"/>
               </w:rPr>
-              <w:t>OperationType</w:t>
-            </w:r>
-            <w:r>
-              <w:rPr>
-                <w:rFonts w:cs="Times New Roman"/>
-                <w:szCs w:val="28"/>
-                <w:lang w:val="en-US"/>
-              </w:rPr>
-              <w:t>_id</w:t>
+              <w:t>id</w:t>
             </w:r>
           </w:p>
         </w:tc>

</xml_diff>